<commit_message>
Refactor InventoryController and LoginRequest: clean up code formatting and remove unnecessary lines
</commit_message>
<xml_diff>
--- a/RUTA.docx
+++ b/RUTA.docx
@@ -36,13 +36,7 @@
     </w:p>
     <w:p>
       <w:r>
-        <w:t xml:space="preserve">Tu proyecto puede crecer poco a poco, empezando con usuarios y salarios, y luego añadir otros módulos como facturación, inventario, permisos, etc. Cada módulo es </w:t>
-      </w:r>
-      <w:r>
-        <w:t>independiente,</w:t>
-      </w:r>
-      <w:r>
-        <w:t xml:space="preserve"> pero se conecta con los demás.</w:t>
+        <w:t>Tu proyecto puede crecer poco a poco, empezando con usuarios y salarios, y luego añadir otros módulos como facturación, inventario, permisos, etc. Cada módulo es independiente, pero se conecta con los demás.</w:t>
       </w:r>
     </w:p>
     <w:p/>
@@ -344,15 +338,7 @@
     </w:p>
     <w:p>
       <w:r>
-        <w:t>- Registro/</w:t>
-      </w:r>
-      <w:proofErr w:type="spellStart"/>
-      <w:r>
-        <w:t>Login</w:t>
-      </w:r>
-      <w:proofErr w:type="spellEnd"/>
-      <w:r>
-        <w:t xml:space="preserve"> con validaciones (correo único, contraseña segura).</w:t>
+        <w:t>- Registro/Login con validaciones (correo único, contraseña segura).</w:t>
       </w:r>
     </w:p>
     <w:p>

</xml_diff>